<commit_message>
Update how to guide_GitHub Desktop.docx
</commit_message>
<xml_diff>
--- a/how to guide_GitHub Desktop.docx
+++ b/how to guide_GitHub Desktop.docx
@@ -46,8 +46,8 @@
     </w:p>
     <w:p>
       <w:r>
-        <w:pict w14:anchorId="7F5A3BB6">
-          <v:rect id="_x0000_i1025" style="width:0;height:1.5pt" o:hralign="center" o:hrstd="t" o:hr="t" fillcolor="#a0a0a0" stroked="f"/>
+        <w:pict w14:anchorId="43C6BEED">
+          <v:rect id="_x0000_i1043" style="width:0;height:1.5pt" o:hralign="center" o:hrstd="t" o:hr="t" fillcolor="#a0a0a0" stroked="f"/>
         </w:pict>
       </w:r>
     </w:p>
@@ -116,7 +116,7 @@
           <w:noProof/>
         </w:rPr>
         <w:drawing>
-          <wp:inline distT="0" distB="0" distL="0" distR="0" wp14:anchorId="25E13797" wp14:editId="4C1E6882">
+          <wp:inline distT="0" distB="0" distL="0" distR="0" wp14:anchorId="1FEDA55F" wp14:editId="7AEDDFA3">
             <wp:extent cx="2309060" cy="312447"/>
             <wp:effectExtent l="0" t="0" r="0" b="0"/>
             <wp:docPr id="1174425738" name="Picture 1"/>
@@ -161,7 +161,7 @@
           <w:noProof/>
         </w:rPr>
         <w:drawing>
-          <wp:inline distT="0" distB="0" distL="0" distR="0" wp14:anchorId="1FE00088" wp14:editId="6F812E48">
+          <wp:inline distT="0" distB="0" distL="0" distR="0" wp14:anchorId="12A95DEA" wp14:editId="06848A7E">
             <wp:extent cx="3795089" cy="3772227"/>
             <wp:effectExtent l="0" t="0" r="0" b="0"/>
             <wp:docPr id="514906384" name="Picture 1"/>
@@ -199,23 +199,27 @@
     </w:p>
     <w:p>
       <w:r>
-        <w:pict w14:anchorId="43B1B698">
-          <v:rect id="_x0000_i1026" style="width:0;height:1.5pt" o:hralign="center" o:hrstd="t" o:hr="t" fillcolor="#a0a0a0" stroked="f"/>
+        <w:pict w14:anchorId="3A9761B1">
+          <v:rect id="_x0000_i1051" style="width:0;height:1.5pt" o:hralign="center" o:bullet="t" o:hrstd="t" o:hr="t" fillcolor="#a0a0a0" stroked="f"/>
         </w:pict>
       </w:r>
     </w:p>
-    <w:p>
-      <w:pPr>
-        <w:rPr>
-          <w:b/>
-          <w:bCs/>
-        </w:rPr>
-      </w:pPr>
-      <w:r>
-        <w:rPr>
-          <w:b/>
-          <w:bCs/>
-        </w:rPr>
+    <w:p/>
+    <w:p/>
+    <w:p/>
+    <w:p>
+      <w:pPr>
+        <w:rPr>
+          <w:b/>
+          <w:bCs/>
+        </w:rPr>
+      </w:pPr>
+      <w:r>
+        <w:rPr>
+          <w:b/>
+          <w:bCs/>
+        </w:rPr>
+        <w:lastRenderedPageBreak/>
         <w:t>2. Sign In to Your GitHub Account</w:t>
       </w:r>
     </w:p>
@@ -246,9 +250,8 @@
         <w:rPr>
           <w:noProof/>
         </w:rPr>
-        <w:lastRenderedPageBreak/>
         <w:drawing>
-          <wp:inline distT="0" distB="0" distL="0" distR="0" wp14:anchorId="24221E1B" wp14:editId="4BE9AA27">
+          <wp:inline distT="0" distB="0" distL="0" distR="0" wp14:anchorId="25C1A4E5" wp14:editId="10DFA39C">
             <wp:extent cx="5654530" cy="2979678"/>
             <wp:effectExtent l="0" t="0" r="3810" b="0"/>
             <wp:docPr id="1141445857" name="Picture 1"/>
@@ -291,7 +294,7 @@
           <w:noProof/>
         </w:rPr>
         <w:drawing>
-          <wp:inline distT="0" distB="0" distL="0" distR="0" wp14:anchorId="3C826A2D" wp14:editId="72302559">
+          <wp:inline distT="0" distB="0" distL="0" distR="0" wp14:anchorId="6E9456E9" wp14:editId="4BD70E2C">
             <wp:extent cx="3787468" cy="1950889"/>
             <wp:effectExtent l="0" t="0" r="3810" b="0"/>
             <wp:docPr id="812054489" name="Picture 1"/>
@@ -331,8 +334,8 @@
     <w:p/>
     <w:p>
       <w:r>
-        <w:pict w14:anchorId="13B6BA44">
-          <v:rect id="_x0000_i1027" style="width:0;height:1.5pt" o:hralign="center" o:hrstd="t" o:hr="t" fillcolor="#a0a0a0" stroked="f"/>
+        <w:pict w14:anchorId="5C8B83BD">
+          <v:rect id="_x0000_i1044" style="width:0;height:1.5pt" o:hralign="center" o:hrstd="t" o:hr="t" fillcolor="#a0a0a0" stroked="f"/>
         </w:pict>
       </w:r>
     </w:p>
@@ -343,11 +346,28 @@
           <w:bCs/>
         </w:rPr>
       </w:pPr>
-      <w:r>
-        <w:rPr>
-          <w:b/>
-          <w:bCs/>
-        </w:rPr>
+    </w:p>
+    <w:p>
+      <w:pPr>
+        <w:rPr>
+          <w:b/>
+          <w:bCs/>
+        </w:rPr>
+      </w:pPr>
+    </w:p>
+    <w:p>
+      <w:pPr>
+        <w:rPr>
+          <w:b/>
+          <w:bCs/>
+        </w:rPr>
+      </w:pPr>
+      <w:r>
+        <w:rPr>
+          <w:b/>
+          <w:bCs/>
+        </w:rPr>
+        <w:lastRenderedPageBreak/>
         <w:t>3. Create or Select a Repository</w:t>
       </w:r>
     </w:p>
@@ -400,9 +420,8 @@
         <w:rPr>
           <w:noProof/>
         </w:rPr>
-        <w:lastRenderedPageBreak/>
         <w:drawing>
-          <wp:inline distT="0" distB="0" distL="0" distR="0" wp14:anchorId="10C49012" wp14:editId="5FD7CE84">
+          <wp:inline distT="0" distB="0" distL="0" distR="0" wp14:anchorId="14478C9F" wp14:editId="17EA730D">
             <wp:extent cx="5630061" cy="3267531"/>
             <wp:effectExtent l="0" t="0" r="8890" b="9525"/>
             <wp:docPr id="1338534432" name="Picture 1"/>
@@ -457,6 +476,7 @@
         </w:numPr>
       </w:pPr>
       <w:r>
+        <w:lastRenderedPageBreak/>
         <w:t xml:space="preserve">Click </w:t>
       </w:r>
       <w:r>
@@ -469,14 +489,14 @@
       <w:r>
         <w:t>.</w:t>
       </w:r>
-    </w:p>
-    <w:p>
-      <w:r>
-        <w:lastRenderedPageBreak/>
+      <w:r>
+        <w:t xml:space="preserve"> </w:t>
+      </w:r>
+      <w:r>
         <w:drawing>
-          <wp:inline distT="0" distB="0" distL="0" distR="0" wp14:anchorId="3939211E" wp14:editId="23EDFB86">
-            <wp:extent cx="5943600" cy="4220210"/>
-            <wp:effectExtent l="0" t="0" r="0" b="8890"/>
+          <wp:inline distT="0" distB="0" distL="0" distR="0" wp14:anchorId="184C718C" wp14:editId="47ACC7B3">
+            <wp:extent cx="5600700" cy="3976735"/>
+            <wp:effectExtent l="0" t="0" r="0" b="5080"/>
             <wp:docPr id="778738017" name="Picture 1"/>
             <wp:cNvGraphicFramePr>
               <a:graphicFrameLocks xmlns:a="http://schemas.openxmlformats.org/drawingml/2006/main" noChangeAspect="1"/>
@@ -497,7 +517,7 @@
                   <pic:spPr>
                     <a:xfrm>
                       <a:off x="0" y="0"/>
-                      <a:ext cx="5943600" cy="4220210"/>
+                      <a:ext cx="5615723" cy="3987402"/>
                     </a:xfrm>
                     <a:prstGeom prst="rect">
                       <a:avLst/>
@@ -546,6 +566,43 @@
       <w:r>
         <w:t>.</w:t>
       </w:r>
+      <w:r>
+        <w:drawing>
+          <wp:inline distT="0" distB="0" distL="0" distR="0" wp14:anchorId="4A75EE93" wp14:editId="294E615C">
+            <wp:extent cx="4001058" cy="3000794"/>
+            <wp:effectExtent l="0" t="0" r="0" b="9525"/>
+            <wp:docPr id="1233390537" name="Picture 1"/>
+            <wp:cNvGraphicFramePr>
+              <a:graphicFrameLocks xmlns:a="http://schemas.openxmlformats.org/drawingml/2006/main" noChangeAspect="1"/>
+            </wp:cNvGraphicFramePr>
+            <a:graphic xmlns:a="http://schemas.openxmlformats.org/drawingml/2006/main">
+              <a:graphicData uri="http://schemas.openxmlformats.org/drawingml/2006/picture">
+                <pic:pic xmlns:pic="http://schemas.openxmlformats.org/drawingml/2006/picture">
+                  <pic:nvPicPr>
+                    <pic:cNvPr id="1233390537" name=""/>
+                    <pic:cNvPicPr/>
+                  </pic:nvPicPr>
+                  <pic:blipFill>
+                    <a:blip r:embed="rId14"/>
+                    <a:stretch>
+                      <a:fillRect/>
+                    </a:stretch>
+                  </pic:blipFill>
+                  <pic:spPr>
+                    <a:xfrm>
+                      <a:off x="0" y="0"/>
+                      <a:ext cx="4001058" cy="3000794"/>
+                    </a:xfrm>
+                    <a:prstGeom prst="rect">
+                      <a:avLst/>
+                    </a:prstGeom>
+                  </pic:spPr>
+                </pic:pic>
+              </a:graphicData>
+            </a:graphic>
+          </wp:inline>
+        </w:drawing>
+      </w:r>
     </w:p>
     <w:p>
       <w:pPr>
@@ -555,6 +612,7 @@
         </w:numPr>
       </w:pPr>
       <w:r>
+        <w:lastRenderedPageBreak/>
         <w:t>Choose a repository from your GitHub account.</w:t>
       </w:r>
     </w:p>
@@ -579,19 +637,11 @@
         <w:t>.</w:t>
       </w:r>
     </w:p>
-    <w:p>
-      <w:r>
-        <w:rPr>
-          <w:b/>
-          <w:bCs/>
-        </w:rPr>
-        <w:t>[Insert Screenshot Here]</w:t>
-      </w:r>
-    </w:p>
-    <w:p>
-      <w:r>
-        <w:pict w14:anchorId="64147C65">
-          <v:rect id="_x0000_i1028" style="width:0;height:1.5pt" o:hralign="center" o:hrstd="t" o:hr="t" fillcolor="#a0a0a0" stroked="f"/>
+    <w:p/>
+    <w:p>
+      <w:r>
+        <w:pict w14:anchorId="6F49CB97">
+          <v:rect id="_x0000_i1045" style="width:0;height:1.5pt" o:hralign="center" o:hrstd="t" o:hr="t" fillcolor="#a0a0a0" stroked="f"/>
         </w:pict>
       </w:r>
     </w:p>
@@ -602,6 +652,46 @@
           <w:bCs/>
         </w:rPr>
       </w:pPr>
+    </w:p>
+    <w:p>
+      <w:pPr>
+        <w:rPr>
+          <w:b/>
+          <w:bCs/>
+        </w:rPr>
+      </w:pPr>
+    </w:p>
+    <w:p>
+      <w:pPr>
+        <w:rPr>
+          <w:b/>
+          <w:bCs/>
+        </w:rPr>
+      </w:pPr>
+    </w:p>
+    <w:p>
+      <w:pPr>
+        <w:rPr>
+          <w:b/>
+          <w:bCs/>
+        </w:rPr>
+      </w:pPr>
+    </w:p>
+    <w:p>
+      <w:pPr>
+        <w:rPr>
+          <w:b/>
+          <w:bCs/>
+        </w:rPr>
+      </w:pPr>
+    </w:p>
+    <w:p>
+      <w:pPr>
+        <w:rPr>
+          <w:b/>
+          <w:bCs/>
+        </w:rPr>
+      </w:pPr>
       <w:r>
         <w:rPr>
           <w:b/>
@@ -613,21 +703,6 @@
     <w:p>
       <w:r>
         <w:t>You can add content in two ways:</w:t>
-      </w:r>
-    </w:p>
-    <w:p>
-      <w:pPr>
-        <w:rPr>
-          <w:b/>
-          <w:bCs/>
-        </w:rPr>
-      </w:pPr>
-      <w:r>
-        <w:rPr>
-          <w:b/>
-          <w:bCs/>
-        </w:rPr>
-        <w:t>Method A: Drag and Drop</w:t>
       </w:r>
     </w:p>
     <w:p>
@@ -645,33 +720,6 @@
       <w:pPr>
         <w:numPr>
           <w:ilvl w:val="0"/>
-          <w:numId w:val="5"/>
-        </w:numPr>
-      </w:pPr>
-      <w:r>
-        <w:t>Drag your file or folder into it.</w:t>
-      </w:r>
-    </w:p>
-    <w:p>
-      <w:pPr>
-        <w:rPr>
-          <w:b/>
-          <w:bCs/>
-        </w:rPr>
-      </w:pPr>
-      <w:r>
-        <w:rPr>
-          <w:b/>
-          <w:bCs/>
-        </w:rPr>
-        <w:lastRenderedPageBreak/>
-        <w:t>Method B: Use File Explorer/Finder</w:t>
-      </w:r>
-    </w:p>
-    <w:p>
-      <w:pPr>
-        <w:numPr>
-          <w:ilvl w:val="0"/>
           <w:numId w:val="6"/>
         </w:numPr>
       </w:pPr>
@@ -686,19 +734,74 @@
     </w:p>
     <w:p>
       <w:r>
-        <w:rPr>
-          <w:b/>
-          <w:bCs/>
-        </w:rPr>
-        <w:t>[Insert Screenshot Here]</w:t>
-      </w:r>
-    </w:p>
-    <w:p>
-      <w:r>
-        <w:pict w14:anchorId="00F529A7">
-          <v:rect id="_x0000_i1029" style="width:0;height:1.5pt" o:hralign="center" o:hrstd="t" o:hr="t" fillcolor="#a0a0a0" stroked="f"/>
+        <w:drawing>
+          <wp:inline distT="0" distB="0" distL="0" distR="0" wp14:anchorId="3EF9C5BD" wp14:editId="0F23A9CC">
+            <wp:extent cx="2987299" cy="2400508"/>
+            <wp:effectExtent l="0" t="0" r="3810" b="0"/>
+            <wp:docPr id="1761351740" name="Picture 1"/>
+            <wp:cNvGraphicFramePr>
+              <a:graphicFrameLocks xmlns:a="http://schemas.openxmlformats.org/drawingml/2006/main" noChangeAspect="1"/>
+            </wp:cNvGraphicFramePr>
+            <a:graphic xmlns:a="http://schemas.openxmlformats.org/drawingml/2006/main">
+              <a:graphicData uri="http://schemas.openxmlformats.org/drawingml/2006/picture">
+                <pic:pic xmlns:pic="http://schemas.openxmlformats.org/drawingml/2006/picture">
+                  <pic:nvPicPr>
+                    <pic:cNvPr id="1761351740" name=""/>
+                    <pic:cNvPicPr/>
+                  </pic:nvPicPr>
+                  <pic:blipFill>
+                    <a:blip r:embed="rId15"/>
+                    <a:stretch>
+                      <a:fillRect/>
+                    </a:stretch>
+                  </pic:blipFill>
+                  <pic:spPr>
+                    <a:xfrm>
+                      <a:off x="0" y="0"/>
+                      <a:ext cx="2987299" cy="2400508"/>
+                    </a:xfrm>
+                    <a:prstGeom prst="rect">
+                      <a:avLst/>
+                    </a:prstGeom>
+                  </pic:spPr>
+                </pic:pic>
+              </a:graphicData>
+            </a:graphic>
+          </wp:inline>
+        </w:drawing>
+      </w:r>
+    </w:p>
+    <w:p/>
+    <w:p>
+      <w:r>
+        <w:pict w14:anchorId="7D144934">
+          <v:rect id="_x0000_i1046" style="width:0;height:1.5pt" o:hralign="center" o:hrstd="t" o:hr="t" fillcolor="#a0a0a0" stroked="f"/>
         </w:pict>
       </w:r>
+    </w:p>
+    <w:p>
+      <w:pPr>
+        <w:rPr>
+          <w:b/>
+          <w:bCs/>
+        </w:rPr>
+      </w:pPr>
+    </w:p>
+    <w:p>
+      <w:pPr>
+        <w:rPr>
+          <w:b/>
+          <w:bCs/>
+        </w:rPr>
+      </w:pPr>
+    </w:p>
+    <w:p>
+      <w:pPr>
+        <w:rPr>
+          <w:b/>
+          <w:bCs/>
+        </w:rPr>
+      </w:pPr>
     </w:p>
     <w:p>
       <w:pPr>
@@ -791,19 +894,97 @@
     </w:p>
     <w:p>
       <w:r>
-        <w:rPr>
-          <w:b/>
-          <w:bCs/>
-        </w:rPr>
-        <w:t>[Insert Screenshot Here]</w:t>
-      </w:r>
-    </w:p>
-    <w:p>
-      <w:r>
-        <w:pict w14:anchorId="584BA1EA">
-          <v:rect id="_x0000_i1030" style="width:0;height:1.5pt" o:hralign="center" o:hrstd="t" o:hr="t" fillcolor="#a0a0a0" stroked="f"/>
+        <w:drawing>
+          <wp:inline distT="0" distB="0" distL="0" distR="0" wp14:anchorId="6635AB2F" wp14:editId="33F50D21">
+            <wp:extent cx="5943600" cy="4244975"/>
+            <wp:effectExtent l="0" t="0" r="0" b="3175"/>
+            <wp:docPr id="1337256245" name="Picture 1"/>
+            <wp:cNvGraphicFramePr>
+              <a:graphicFrameLocks xmlns:a="http://schemas.openxmlformats.org/drawingml/2006/main" noChangeAspect="1"/>
+            </wp:cNvGraphicFramePr>
+            <a:graphic xmlns:a="http://schemas.openxmlformats.org/drawingml/2006/main">
+              <a:graphicData uri="http://schemas.openxmlformats.org/drawingml/2006/picture">
+                <pic:pic xmlns:pic="http://schemas.openxmlformats.org/drawingml/2006/picture">
+                  <pic:nvPicPr>
+                    <pic:cNvPr id="1337256245" name=""/>
+                    <pic:cNvPicPr/>
+                  </pic:nvPicPr>
+                  <pic:blipFill>
+                    <a:blip r:embed="rId16"/>
+                    <a:stretch>
+                      <a:fillRect/>
+                    </a:stretch>
+                  </pic:blipFill>
+                  <pic:spPr>
+                    <a:xfrm>
+                      <a:off x="0" y="0"/>
+                      <a:ext cx="5943600" cy="4244975"/>
+                    </a:xfrm>
+                    <a:prstGeom prst="rect">
+                      <a:avLst/>
+                    </a:prstGeom>
+                  </pic:spPr>
+                </pic:pic>
+              </a:graphicData>
+            </a:graphic>
+          </wp:inline>
+        </w:drawing>
+      </w:r>
+    </w:p>
+    <w:p>
+      <w:r>
+        <w:pict w14:anchorId="0E4938B8">
+          <v:rect id="_x0000_i1047" style="width:0;height:1.5pt" o:hralign="center" o:hrstd="t" o:hr="t" fillcolor="#a0a0a0" stroked="f"/>
         </w:pict>
       </w:r>
+    </w:p>
+    <w:p>
+      <w:pPr>
+        <w:rPr>
+          <w:b/>
+          <w:bCs/>
+        </w:rPr>
+      </w:pPr>
+    </w:p>
+    <w:p>
+      <w:pPr>
+        <w:rPr>
+          <w:b/>
+          <w:bCs/>
+        </w:rPr>
+      </w:pPr>
+    </w:p>
+    <w:p>
+      <w:pPr>
+        <w:rPr>
+          <w:b/>
+          <w:bCs/>
+        </w:rPr>
+      </w:pPr>
+    </w:p>
+    <w:p>
+      <w:pPr>
+        <w:rPr>
+          <w:b/>
+          <w:bCs/>
+        </w:rPr>
+      </w:pPr>
+    </w:p>
+    <w:p>
+      <w:pPr>
+        <w:rPr>
+          <w:b/>
+          <w:bCs/>
+        </w:rPr>
+      </w:pPr>
+    </w:p>
+    <w:p>
+      <w:pPr>
+        <w:rPr>
+          <w:b/>
+          <w:bCs/>
+        </w:rPr>
+      </w:pPr>
     </w:p>
     <w:p>
       <w:pPr>
@@ -852,15 +1033,159 @@
           <w:b/>
           <w:bCs/>
         </w:rPr>
-        <w:t>[Insert Screenshot Here]</w:t>
-      </w:r>
-    </w:p>
-    <w:p>
-      <w:r>
-        <w:pict w14:anchorId="688F7B54">
-          <v:rect id="_x0000_i1031" style="width:0;height:1.5pt" o:hralign="center" o:hrstd="t" o:hr="t" fillcolor="#a0a0a0" stroked="f"/>
+        <w:drawing>
+          <wp:inline distT="0" distB="0" distL="0" distR="0" wp14:anchorId="5B0589C5" wp14:editId="7E834226">
+            <wp:extent cx="2590800" cy="2512528"/>
+            <wp:effectExtent l="0" t="0" r="0" b="2540"/>
+            <wp:docPr id="1002606432" name="Picture 1"/>
+            <wp:cNvGraphicFramePr>
+              <a:graphicFrameLocks xmlns:a="http://schemas.openxmlformats.org/drawingml/2006/main" noChangeAspect="1"/>
+            </wp:cNvGraphicFramePr>
+            <a:graphic xmlns:a="http://schemas.openxmlformats.org/drawingml/2006/main">
+              <a:graphicData uri="http://schemas.openxmlformats.org/drawingml/2006/picture">
+                <pic:pic xmlns:pic="http://schemas.openxmlformats.org/drawingml/2006/picture">
+                  <pic:nvPicPr>
+                    <pic:cNvPr id="1002606432" name=""/>
+                    <pic:cNvPicPr/>
+                  </pic:nvPicPr>
+                  <pic:blipFill>
+                    <a:blip r:embed="rId17"/>
+                    <a:stretch>
+                      <a:fillRect/>
+                    </a:stretch>
+                  </pic:blipFill>
+                  <pic:spPr>
+                    <a:xfrm>
+                      <a:off x="0" y="0"/>
+                      <a:ext cx="2609032" cy="2530209"/>
+                    </a:xfrm>
+                    <a:prstGeom prst="rect">
+                      <a:avLst/>
+                    </a:prstGeom>
+                  </pic:spPr>
+                </pic:pic>
+              </a:graphicData>
+            </a:graphic>
+          </wp:inline>
+        </w:drawing>
+      </w:r>
+      <w:r>
+        <w:pict w14:anchorId="2A11A2D1">
+          <v:rect id="_x0000_i1048" style="width:0;height:1.5pt" o:hralign="center" o:hrstd="t" o:hr="t" fillcolor="#a0a0a0" stroked="f"/>
         </w:pict>
       </w:r>
+    </w:p>
+    <w:p>
+      <w:pPr>
+        <w:rPr>
+          <w:b/>
+          <w:bCs/>
+        </w:rPr>
+      </w:pPr>
+    </w:p>
+    <w:p>
+      <w:pPr>
+        <w:rPr>
+          <w:b/>
+          <w:bCs/>
+        </w:rPr>
+      </w:pPr>
+    </w:p>
+    <w:p>
+      <w:pPr>
+        <w:rPr>
+          <w:b/>
+          <w:bCs/>
+        </w:rPr>
+      </w:pPr>
+    </w:p>
+    <w:p>
+      <w:pPr>
+        <w:rPr>
+          <w:b/>
+          <w:bCs/>
+        </w:rPr>
+      </w:pPr>
+    </w:p>
+    <w:p>
+      <w:pPr>
+        <w:rPr>
+          <w:b/>
+          <w:bCs/>
+        </w:rPr>
+      </w:pPr>
+    </w:p>
+    <w:p>
+      <w:pPr>
+        <w:rPr>
+          <w:b/>
+          <w:bCs/>
+        </w:rPr>
+      </w:pPr>
+    </w:p>
+    <w:p>
+      <w:pPr>
+        <w:rPr>
+          <w:b/>
+          <w:bCs/>
+        </w:rPr>
+      </w:pPr>
+    </w:p>
+    <w:p>
+      <w:pPr>
+        <w:rPr>
+          <w:b/>
+          <w:bCs/>
+        </w:rPr>
+      </w:pPr>
+    </w:p>
+    <w:p>
+      <w:pPr>
+        <w:rPr>
+          <w:b/>
+          <w:bCs/>
+        </w:rPr>
+      </w:pPr>
+    </w:p>
+    <w:p>
+      <w:pPr>
+        <w:rPr>
+          <w:b/>
+          <w:bCs/>
+        </w:rPr>
+      </w:pPr>
+    </w:p>
+    <w:p>
+      <w:pPr>
+        <w:rPr>
+          <w:b/>
+          <w:bCs/>
+        </w:rPr>
+      </w:pPr>
+    </w:p>
+    <w:p>
+      <w:pPr>
+        <w:rPr>
+          <w:b/>
+          <w:bCs/>
+        </w:rPr>
+      </w:pPr>
+    </w:p>
+    <w:p>
+      <w:pPr>
+        <w:rPr>
+          <w:b/>
+          <w:bCs/>
+        </w:rPr>
+      </w:pPr>
+    </w:p>
+    <w:p>
+      <w:pPr>
+        <w:rPr>
+          <w:b/>
+          <w:bCs/>
+        </w:rPr>
+      </w:pPr>
     </w:p>
     <w:p>
       <w:pPr>
@@ -892,7 +1217,7 @@
           <w:b/>
           <w:bCs/>
         </w:rPr>
-        <w:t>Push origin</w:t>
+        <w:t>Publish repository</w:t>
       </w:r>
       <w:r>
         <w:t xml:space="preserve"> at the top.</w:t>
@@ -909,13 +1234,45 @@
           <w:b/>
           <w:bCs/>
         </w:rPr>
-        <w:t>[Insert Screenshot Here]</w:t>
-      </w:r>
-    </w:p>
-    <w:p>
-      <w:r>
-        <w:pict w14:anchorId="637B2B57">
-          <v:rect id="_x0000_i1032" style="width:0;height:1.5pt" o:hralign="center" o:hrstd="t" o:hr="t" fillcolor="#a0a0a0" stroked="f"/>
+        <w:drawing>
+          <wp:inline distT="0" distB="0" distL="0" distR="0" wp14:anchorId="0C8DA81D" wp14:editId="31772133">
+            <wp:extent cx="5943600" cy="4399280"/>
+            <wp:effectExtent l="0" t="0" r="0" b="1270"/>
+            <wp:docPr id="668967185" name="Picture 1"/>
+            <wp:cNvGraphicFramePr>
+              <a:graphicFrameLocks xmlns:a="http://schemas.openxmlformats.org/drawingml/2006/main" noChangeAspect="1"/>
+            </wp:cNvGraphicFramePr>
+            <a:graphic xmlns:a="http://schemas.openxmlformats.org/drawingml/2006/main">
+              <a:graphicData uri="http://schemas.openxmlformats.org/drawingml/2006/picture">
+                <pic:pic xmlns:pic="http://schemas.openxmlformats.org/drawingml/2006/picture">
+                  <pic:nvPicPr>
+                    <pic:cNvPr id="668967185" name=""/>
+                    <pic:cNvPicPr/>
+                  </pic:nvPicPr>
+                  <pic:blipFill>
+                    <a:blip r:embed="rId18"/>
+                    <a:stretch>
+                      <a:fillRect/>
+                    </a:stretch>
+                  </pic:blipFill>
+                  <pic:spPr>
+                    <a:xfrm>
+                      <a:off x="0" y="0"/>
+                      <a:ext cx="5943600" cy="4399280"/>
+                    </a:xfrm>
+                    <a:prstGeom prst="rect">
+                      <a:avLst/>
+                    </a:prstGeom>
+                  </pic:spPr>
+                </pic:pic>
+              </a:graphicData>
+            </a:graphic>
+          </wp:inline>
+        </w:drawing>
+      </w:r>
+      <w:r>
+        <w:pict w14:anchorId="019FF9B5">
+          <v:rect id="_x0000_i1049" style="width:0;height:1.5pt" o:hralign="center" o:hrstd="t" o:hr="t" fillcolor="#a0a0a0" stroked="f"/>
         </w:pict>
       </w:r>
     </w:p>
@@ -933,7 +1290,7 @@
         </w:rPr>
         <w:t xml:space="preserve">8. Verify on </w:t>
       </w:r>
-      <w:hyperlink r:id="rId14" w:history="1">
+      <w:hyperlink r:id="rId19" w:history="1">
         <w:r>
           <w:rPr>
             <w:rStyle w:val="Hyperlink"/>
@@ -954,7 +1311,7 @@
       <w:r>
         <w:t xml:space="preserve">Open your repository on </w:t>
       </w:r>
-      <w:hyperlink r:id="rId15" w:history="1">
+      <w:hyperlink r:id="rId20" w:history="1">
         <w:r>
           <w:rPr>
             <w:rStyle w:val="Hyperlink"/>
@@ -990,20 +1347,34 @@
     </w:p>
     <w:p>
       <w:r>
-        <w:rPr>
-          <w:b/>
-          <w:bCs/>
-        </w:rPr>
-        <w:lastRenderedPageBreak/>
-        <w:t>[Insert Screenshot Here]</w:t>
-      </w:r>
-    </w:p>
-    <w:p>
-      <w:r>
-        <w:pict w14:anchorId="073AA30B">
-          <v:rect id="_x0000_i1033" style="width:0;height:1.5pt" o:hralign="center" o:hrstd="t" o:hr="t" fillcolor="#a0a0a0" stroked="f"/>
+        <w:pict w14:anchorId="713B36B2">
+          <v:rect id="_x0000_i1050" style="width:0;height:1.5pt" o:hralign="center" o:hrstd="t" o:hr="t" fillcolor="#a0a0a0" stroked="f"/>
         </w:pict>
       </w:r>
+    </w:p>
+    <w:p>
+      <w:pPr>
+        <w:rPr>
+          <w:b/>
+          <w:bCs/>
+        </w:rPr>
+      </w:pPr>
+    </w:p>
+    <w:p>
+      <w:pPr>
+        <w:rPr>
+          <w:b/>
+          <w:bCs/>
+        </w:rPr>
+      </w:pPr>
+    </w:p>
+    <w:p>
+      <w:pPr>
+        <w:rPr>
+          <w:b/>
+          <w:bCs/>
+        </w:rPr>
+      </w:pPr>
     </w:p>
     <w:p>
       <w:pPr>
@@ -1080,11 +1451,7 @@
         <w:t>Verifying uploads on GitHub</w:t>
       </w:r>
     </w:p>
-    <w:p>
-      <w:r>
-        <w:t>You can now insert your screenshots in the placeholders above to complete the document.</w:t>
-      </w:r>
-    </w:p>
+    <w:p/>
     <w:p/>
     <w:sectPr>
       <w:pgSz w:w="12240" w:h="15840"/>
@@ -3223,6 +3590,7 @@
   <w:style w:type="paragraph" w:default="1" w:styleId="Normal">
     <w:name w:val="Normal"/>
     <w:qFormat/>
+    <w:rsid w:val="00086C2C"/>
   </w:style>
   <w:style w:type="paragraph" w:styleId="Heading1">
     <w:name w:val="heading 1"/>

</xml_diff>